<commit_message>
POP (DOCX): texto do passo logo abaixo do print, em caixa de destaque creme
Co-Authored-By: Claude Opus 5.5 <noreply@anthropic.com>
Claude-Session: https://claude.ai/code/session_01WmX1FeLej794b7ZZRcPkyZ
</commit_message>
<xml_diff>
--- a/templates/pop/modelo-pop-v3.template.docx
+++ b/templates/pop/modelo-pop-v3.template.docx
@@ -1692,17 +1692,7 @@
     </w:p>
     <w:p>
       <w:r>
-        <w:t xml:space="preserve">{@imagem}</w:t>
-      </w:r>
-    </w:p>
-    <w:p>
-      <w:r>
-        <w:rPr>
-          <w:i/>
-          <w:sz w:val="18"/>
-          <w:color w:val="5B6B70"/>
-        </w:rPr>
-        <w:t xml:space="preserve">{legenda}</w:t>
+        <w:t xml:space="preserve">{@tela}</w:t>
       </w:r>
     </w:p>
     <w:p>

</xml_diff>